<commit_message>
một chuẩn bị nhỏ
</commit_message>
<xml_diff>
--- a/assets/Vietnamese-RVC-DOCS.docx
+++ b/assets/Vietnamese-RVC-DOCS.docx
@@ -25049,6 +25049,36 @@
       </w:r>
       <w:r>
         <w:t xml:space="preserve"> Đường dẫn thư mục cache của quá trình biên dịch mô hình.</w:t>
+      </w:r>
+    </w:p>
+    <w:p>
+      <w:pPr>
+        <w:pStyle w:val="ListParagraph"/>
+        <w:numPr>
+          <w:ilvl w:val="0"/>
+          <w:numId w:val="41"/>
+        </w:numPr>
+        <w:rPr>
+          <w:b/>
+          <w:bCs/>
+        </w:rPr>
+      </w:pPr>
+      <w:r>
+        <w:rPr>
+          <w:b/>
+          <w:bCs/>
+        </w:rPr>
+        <w:t>check_data</w:t>
+      </w:r>
+      <w:r>
+        <w:rPr>
+          <w:b/>
+          <w:bCs/>
+        </w:rPr>
+        <w:t xml:space="preserve">: </w:t>
+      </w:r>
+      <w:r>
+        <w:t>Dùng để kiểm tra dữ liệu của phần huấn luyện trước khi chạy bất kỳ tiến trình nào liên quan đến huấn luyện.</w:t>
       </w:r>
     </w:p>
     <w:sectPr>

</xml_diff>